<commit_message>
Bibliography edited till chapter 3
</commit_message>
<xml_diff>
--- a/Docs/Thesis.docx
+++ b/Docs/Thesis.docx
@@ -875,7 +875,17 @@
                 <w:sz w:val="28"/>
                 <w:szCs w:val="28"/>
               </w:rPr>
-              <w:t xml:space="preserve">CHAPTER 2: The </w:t>
+              <w:t>CHAPTER 2: The</w:t>
+            </w:r>
+            <w:r>
+              <w:rPr>
+                <w:rStyle w:val="Hyperlink"/>
+                <w:rFonts w:ascii="Arial" w:hAnsi="Arial" w:cs="Arial"/>
+                <w:noProof/>
+                <w:sz w:val="28"/>
+                <w:szCs w:val="28"/>
+              </w:rPr>
+              <w:t xml:space="preserve"> </w:t>
             </w:r>
             <w:r>
               <w:rPr>
@@ -886,7 +896,29 @@
                 <w:szCs w:val="28"/>
                 <w:lang w:eastAsia="en-US"/>
               </w:rPr>
-              <w:t>Magic of Machine Learning</w:t>
+              <w:t>Magic</w:t>
+            </w:r>
+            <w:r>
+              <w:rPr>
+                <w:rStyle w:val="Hyperlink"/>
+                <w:rFonts w:ascii="Arial" w:eastAsia="Aptos" w:hAnsi="Arial" w:cs="Arial"/>
+                <w:noProof/>
+                <w:sz w:val="28"/>
+                <w:szCs w:val="28"/>
+                <w:lang w:eastAsia="en-US"/>
+              </w:rPr>
+              <w:t xml:space="preserve"> </w:t>
+            </w:r>
+            <w:r>
+              <w:rPr>
+                <w:rStyle w:val="Hyperlink"/>
+                <w:rFonts w:ascii="Arial" w:eastAsia="Aptos" w:hAnsi="Arial" w:cs="Arial"/>
+                <w:noProof/>
+                <w:sz w:val="28"/>
+                <w:szCs w:val="28"/>
+                <w:lang w:eastAsia="en-US"/>
+              </w:rPr>
+              <w:t>of Machine Learning</w:t>
             </w:r>
             <w:r>
               <w:rPr>
@@ -945,7 +977,7 @@
                 <w:sz w:val="28"/>
                 <w:szCs w:val="28"/>
               </w:rPr>
-              <w:t>5</w:t>
+              <w:t>6</w:t>
             </w:r>
             <w:r>
               <w:rPr>
@@ -1046,7 +1078,7 @@
                 <w:sz w:val="28"/>
                 <w:szCs w:val="28"/>
               </w:rPr>
-              <w:t>7</w:t>
+              <w:t>8</w:t>
             </w:r>
             <w:r>
               <w:rPr>
@@ -1158,7 +1190,7 @@
                 <w:sz w:val="28"/>
                 <w:szCs w:val="28"/>
               </w:rPr>
-              <w:t>11</w:t>
+              <w:t>12</w:t>
             </w:r>
             <w:r>
               <w:rPr>
@@ -1270,7 +1302,7 @@
                 <w:sz w:val="28"/>
                 <w:szCs w:val="28"/>
               </w:rPr>
-              <w:t>15</w:t>
+              <w:t>16</w:t>
             </w:r>
             <w:r>
               <w:rPr>
@@ -1382,7 +1414,7 @@
                 <w:sz w:val="28"/>
                 <w:szCs w:val="28"/>
               </w:rPr>
-              <w:t>20</w:t>
+              <w:t>21</w:t>
             </w:r>
             <w:r>
               <w:rPr>
@@ -1494,7 +1526,7 @@
                 <w:sz w:val="28"/>
                 <w:szCs w:val="28"/>
               </w:rPr>
-              <w:t>24</w:t>
+              <w:t>25</w:t>
             </w:r>
             <w:r>
               <w:rPr>
@@ -1596,7 +1628,7 @@
                 <w:sz w:val="28"/>
                 <w:szCs w:val="28"/>
               </w:rPr>
-              <w:t>32</w:t>
+              <w:t>33</w:t>
             </w:r>
             <w:r>
               <w:rPr>
@@ -1698,7 +1730,7 @@
                 <w:sz w:val="28"/>
                 <w:szCs w:val="28"/>
               </w:rPr>
-              <w:t>43</w:t>
+              <w:t>44</w:t>
             </w:r>
             <w:r>
               <w:rPr>
@@ -1823,7 +1855,79 @@
         <w:pStyle w:val="MyNormal"/>
       </w:pPr>
       <w:r>
-        <w:t xml:space="preserve">Development inspiration for the Digital Companion was linked to a big emptiness in mental health care. Notable was its impact on people, especially those who face trouble in orthodox therapy. Mental illnesses are growing more and more numerous. Yet many individuals, maybe more so introverts or anxious types, and those who are shy, find great trouble commencing the process of help-seeking. They experience, you could say, a massive feeling of being judged by others or awkwardness felt from revealing oneself to a therapist, one on one, in person. Such an unfavorable environment contributes to unsettling reactions, which then lead to the extinction of initiative or maybe just a delay in seeking help. And this is </w:t>
+        <w:t>Development inspiration for the Digital Companion was linked to a big emptiness in mental health care. Notable was its impact on people, especially those who face trouble in orthodox therapy. Mental illnesses are growing more and more numerous</w:t>
+      </w:r>
+      <w:r>
+        <w:t xml:space="preserve"> </w:t>
+      </w:r>
+      <w:sdt>
+        <w:sdtPr>
+          <w:id w:val="1845358257"/>
+          <w:citation/>
+        </w:sdtPr>
+        <w:sdtContent>
+          <w:r>
+            <w:fldChar w:fldCharType="begin"/>
+          </w:r>
+          <w:r>
+            <w:rPr>
+              <w:lang w:val="en-GB"/>
+            </w:rPr>
+            <w:instrText xml:space="preserve"> CITATION Wor22 \l 2057 </w:instrText>
+          </w:r>
+          <w:r>
+            <w:fldChar w:fldCharType="separate"/>
+          </w:r>
+          <w:r>
+            <w:rPr>
+              <w:noProof/>
+              <w:lang w:val="en-GB"/>
+            </w:rPr>
+            <w:t>(World Health Organization, 2022)</w:t>
+          </w:r>
+          <w:r>
+            <w:fldChar w:fldCharType="end"/>
+          </w:r>
+        </w:sdtContent>
+      </w:sdt>
+      <w:r>
+        <w:t>Yet many individuals, maybe more so introverts or anxious types, and those who are shy, find great trouble commencing the process of help-seeking. They experience, you could say, a massive feeling of being judged by others or awkwardness felt from revealing oneself to a therapist, one on one, in person. Such an unfavorable environment contributes to unsettling reactions, which then lead to the extinction of initiative or maybe just a delay in seeking help</w:t>
+      </w:r>
+      <w:r>
+        <w:t xml:space="preserve"> </w:t>
+      </w:r>
+      <w:sdt>
+        <w:sdtPr>
+          <w:id w:val="1306278692"/>
+          <w:citation/>
+        </w:sdtPr>
+        <w:sdtContent>
+          <w:r>
+            <w:fldChar w:fldCharType="begin"/>
+          </w:r>
+          <w:r>
+            <w:rPr>
+              <w:lang w:val="en-GB"/>
+            </w:rPr>
+            <w:instrText xml:space="preserve"> CITATION Smi221 \l 2057 </w:instrText>
+          </w:r>
+          <w:r>
+            <w:fldChar w:fldCharType="separate"/>
+          </w:r>
+          <w:r>
+            <w:rPr>
+              <w:noProof/>
+              <w:lang w:val="en-GB"/>
+            </w:rPr>
+            <w:t>(Smith, 2022)</w:t>
+          </w:r>
+          <w:r>
+            <w:fldChar w:fldCharType="end"/>
+          </w:r>
+        </w:sdtContent>
+      </w:sdt>
+      <w:r>
+        <w:t xml:space="preserve">And this is </w:t>
       </w:r>
       <w:proofErr w:type="gramStart"/>
       <w:r>
@@ -1831,7 +1935,7 @@
       </w:r>
       <w:proofErr w:type="gramEnd"/>
       <w:r>
-        <w:t xml:space="preserve"> pouring fuel on fire - constantly making the situation worse. Attempting to counter it with this project, which aspires to provide a different option, a softer one, where an AI-linked associated entity could lend emotional succor, offer direction - all this occurring in an atmosphere of seclusion, with a much lower intimidation factor.</w:t>
+        <w:t xml:space="preserve"> pouring fuel on fire - constantly making the situation worse. Attempting to counter it with this project, which aspires to provide a different option, a softer one, where an AI-linked associated entity could lend emotional succor, offer direction all this occurring in an atmosphere of seclusion, with a much lower intimidation factor.</w:t>
       </w:r>
     </w:p>
     <w:p>
@@ -1844,15 +1948,43 @@
         <w:pStyle w:val="MyNormal"/>
       </w:pPr>
       <w:r>
-        <w:t xml:space="preserve">One major motivating factor behind this undertaking is the awareness of the unavailability, in effect, of mental health assistance for many individuals, caused by the steep expenses tied to professional counseling. Old-fashioned therapy, </w:t>
-      </w:r>
-      <w:proofErr w:type="gramStart"/>
-      <w:r>
-        <w:t>indeed</w:t>
-      </w:r>
-      <w:proofErr w:type="gramEnd"/>
-      <w:r>
-        <w:t xml:space="preserve"> helpful, comes with a heavy investment of both time and money, thus unreachable for people lacking sufficient means. This electronic ally has been envisioned to pose as a less expensive alternative, functioning as a link, in some sense, between those seeking aid and the formalized, pricier offerings of a human counselor. By imitating the early stages of therapy, this digital component is capable of aiding patrons in handling their psyche's well-being in a more forward-thinking and cost-effective fashion.</w:t>
+        <w:t>One major motivating factor behind this undertaking is the awareness of the unavailability, in effect, of mental health assistance for many individuals, caused by the steep expenses tied to professional counseling. Old-fashioned therapy, indeed helpful, comes with a heavy investment of both time and money, thus unreachable for people lacking sufficient means</w:t>
+      </w:r>
+      <w:r>
+        <w:t xml:space="preserve"> </w:t>
+      </w:r>
+      <w:sdt>
+        <w:sdtPr>
+          <w:id w:val="-496579104"/>
+          <w:citation/>
+        </w:sdtPr>
+        <w:sdtContent>
+          <w:r>
+            <w:fldChar w:fldCharType="begin"/>
+          </w:r>
+          <w:r>
+            <w:rPr>
+              <w:lang w:val="en-GB"/>
+            </w:rPr>
+            <w:instrText xml:space="preserve"> CITATION Bro211 \l 2057 </w:instrText>
+          </w:r>
+          <w:r>
+            <w:fldChar w:fldCharType="separate"/>
+          </w:r>
+          <w:r>
+            <w:rPr>
+              <w:noProof/>
+              <w:lang w:val="en-GB"/>
+            </w:rPr>
+            <w:t>(Brown, 2021)</w:t>
+          </w:r>
+          <w:r>
+            <w:fldChar w:fldCharType="end"/>
+          </w:r>
+        </w:sdtContent>
+      </w:sdt>
+      <w:r>
+        <w:t>This electronic ally has been envisioned to pose as a less expensive alternative, functioning as a link, in some sense, between those seeking aid and the formalized, pricier offerings of a human counselor. By imitating the early stages of therapy, this digital component is capable of aiding patrons in handling their psyche's well-being in a more forward-thinking and cost-effective fashion.</w:t>
       </w:r>
     </w:p>
     <w:p>
@@ -1865,7 +1997,50 @@
         <w:pStyle w:val="MyNormal"/>
       </w:pPr>
       <w:r>
-        <w:t>Not intended to replace real therapists, the app assists. Nervous individuals, those unable to directly see a therapist, have a stepping block. Engaging with AI improves skills in expressing thoughts and emotions, becoming at ease with therapy. Gradually, it can dismantle some barriers - barriers that disallow pro-health seeking. Also, the AI has a role in assisting doctors, collecting basic information about people and aiding professionals in understanding a patient's state of mind before a therapy room visit. Such a tool currently empowers users and plays a resourceful part for mental health practitioners.</w:t>
+        <w:t>Not intended to replace real therapists, the app assists. Nervous individuals, those unable to directly see a therapist, have a stepping block. Engaging with AI improves skills in expressing thoughts and emotions, becoming at ease with therapy. Gradually, it can dismantle some barriers - barriers that disallow pro-health seeking</w:t>
+      </w:r>
+      <w:r>
+        <w:t xml:space="preserve"> </w:t>
+      </w:r>
+      <w:sdt>
+        <w:sdtPr>
+          <w:id w:val="1630283708"/>
+          <w:citation/>
+        </w:sdtPr>
+        <w:sdtContent>
+          <w:r>
+            <w:fldChar w:fldCharType="begin"/>
+          </w:r>
+          <w:r>
+            <w:rPr>
+              <w:lang w:val="en-GB"/>
+            </w:rPr>
+            <w:instrText xml:space="preserve"> CITATION Dav201 \l 2057 </w:instrText>
+          </w:r>
+          <w:r>
+            <w:fldChar w:fldCharType="separate"/>
+          </w:r>
+          <w:r>
+            <w:rPr>
+              <w:noProof/>
+              <w:lang w:val="en-GB"/>
+            </w:rPr>
+            <w:t>(Davis, 2020)</w:t>
+          </w:r>
+          <w:r>
+            <w:fldChar w:fldCharType="end"/>
+          </w:r>
+        </w:sdtContent>
+      </w:sdt>
+      <w:r>
+        <w:t xml:space="preserve">. </w:t>
+      </w:r>
+      <w:r>
+        <w:t xml:space="preserve">Also, the AI has a role in assisting doctors, collecting basic information about people and aiding professionals in </w:t>
+      </w:r>
+      <w:r>
+        <w:lastRenderedPageBreak/>
+        <w:t>understanding a patient's state of mind before a therapy room visit. Such a tool currently empowers users and plays a resourceful part for mental health practitioners.</w:t>
       </w:r>
     </w:p>
     <w:p>
@@ -1873,7 +2048,6 @@
         <w:pStyle w:val="MyNormal"/>
       </w:pPr>
       <w:r>
-        <w:lastRenderedPageBreak/>
         <w:t>For now, the AI in this initiative has received training on a constrained dataset. Huge potential is there for improvement and increase. As it learns from and interacts with more and varied users, evolution in mimicking real therapists will occur, providing an experience that's increasingly helpful and real-like. Presently, the current iteration is a starting point. Emphasis will be put on growing its knowledge base, refining conversational prowess, and boosting engagement for meaningful mental health support in future app development. Understanding the disjointed progression and less concrete examples are essential elements of this. Errors in grammar and punctuation, as you can see, have also been scattered throughout this narrative.</w:t>
       </w:r>
       <w:r>
@@ -1887,7 +2061,73 @@
         <w:t>fear</w:t>
       </w:r>
       <w:r>
-        <w:t xml:space="preserve"> as well. Hence, the utility of an AI companion peaks, offering a zone, not judged, where users - they can unveil themselves devoid of the weight of interacting with another human. The endgame? Facilitate that inaugural step for people, enhance their mental health: support for self, or maybe gearing up to engage with a professional. Less concrete examples must be examined. Mental health's plight - well, for many individuals, is nebulous and abstract. The courageous first step remains elusive. Is it inaccessible support or lack of clarity? Stigma? These are pertinent. AI: a potential game changer? Possible. The proposed methodology lacks precision and completeness. Nevertheless, still.</w:t>
+        <w:t xml:space="preserve"> as well. Hence, the utility of an AI companion peaks, offering a zone, not judged, where users - they can unveil themselves devoid of the weight of interacting with another human</w:t>
+      </w:r>
+      <w:r>
+        <w:rPr>
+          <w:rFonts w:ascii="-webkit-standard" w:hAnsi="-webkit-standard"/>
+          <w:color w:val="000000"/>
+          <w:sz w:val="27"/>
+          <w:szCs w:val="27"/>
+        </w:rPr>
+        <w:t xml:space="preserve"> </w:t>
+      </w:r>
+      <w:sdt>
+        <w:sdtPr>
+          <w:rPr>
+            <w:rFonts w:ascii="-webkit-standard" w:hAnsi="-webkit-standard"/>
+            <w:color w:val="000000"/>
+            <w:sz w:val="27"/>
+            <w:szCs w:val="27"/>
+          </w:rPr>
+          <w:id w:val="1006182368"/>
+          <w:citation/>
+        </w:sdtPr>
+        <w:sdtContent>
+          <w:r>
+            <w:rPr>
+              <w:rFonts w:ascii="-webkit-standard" w:hAnsi="-webkit-standard"/>
+              <w:color w:val="000000"/>
+              <w:sz w:val="27"/>
+              <w:szCs w:val="27"/>
+            </w:rPr>
+            <w:fldChar w:fldCharType="begin"/>
+          </w:r>
+          <w:r>
+            <w:rPr>
+              <w:lang w:val="en-GB"/>
+            </w:rPr>
+            <w:instrText xml:space="preserve"> CITATION Ill \l 2057 </w:instrText>
+          </w:r>
+          <w:r>
+            <w:rPr>
+              <w:rFonts w:ascii="-webkit-standard" w:hAnsi="-webkit-standard"/>
+              <w:color w:val="000000"/>
+              <w:sz w:val="27"/>
+              <w:szCs w:val="27"/>
+            </w:rPr>
+            <w:fldChar w:fldCharType="separate"/>
+          </w:r>
+          <w:r>
+            <w:rPr>
+              <w:noProof/>
+              <w:lang w:val="en-GB"/>
+            </w:rPr>
+            <w:t>(Illness, n.d.)</w:t>
+          </w:r>
+          <w:r>
+            <w:rPr>
+              <w:rFonts w:ascii="-webkit-standard" w:hAnsi="-webkit-standard"/>
+              <w:color w:val="000000"/>
+              <w:sz w:val="27"/>
+              <w:szCs w:val="27"/>
+            </w:rPr>
+            <w:fldChar w:fldCharType="end"/>
+          </w:r>
+        </w:sdtContent>
+      </w:sdt>
+      <w:r>
+        <w:t>Facilitate that inaugural step for people, enhance their mental health: support for self, or maybe gearing up to engage with a professional. Less concrete examples must be examined. Mental health's plight - well, for many individuals, is nebulous and abstract. The courageous first step remains elusive. Is it inaccessible support or lack of clarity? Stigma? These are pertinent. AI: a potential game changer? Possible. The proposed methodology lacks precision and completeness. Nevertheless, still.</w:t>
       </w:r>
     </w:p>
     <w:p>
@@ -1913,7 +2153,13 @@
       <w:bookmarkStart w:id="12" w:name="_Toc182488186"/>
       <w:bookmarkStart w:id="13" w:name="_Toc182506680"/>
       <w:bookmarkStart w:id="14" w:name="_Toc182506828"/>
-      <w:r>
+    </w:p>
+    <w:p>
+      <w:pPr>
+        <w:pStyle w:val="MyHeading-2"/>
+      </w:pPr>
+      <w:r>
+        <w:lastRenderedPageBreak/>
         <w:t xml:space="preserve">1.1 </w:t>
       </w:r>
       <w:r>
@@ -1948,11 +2194,7 @@
         <w:t xml:space="preserve"> </w:t>
       </w:r>
       <w:r>
-        <w:t xml:space="preserve">an </w:t>
-      </w:r>
-      <w:r>
-        <w:lastRenderedPageBreak/>
-        <w:t>automation of improvement. They give life to human</w:t>
+        <w:t>an automation of improvement. They give life to human</w:t>
       </w:r>
       <w:r>
         <w:t xml:space="preserve"> </w:t>
@@ -2143,6 +2385,7 @@
           <w:b/>
           <w:bCs/>
         </w:rPr>
+        <w:lastRenderedPageBreak/>
         <w:t>Enhancing Accessibility: </w:t>
       </w:r>
     </w:p>
@@ -2163,15 +2406,70 @@
     <w:p>
       <w:pPr>
         <w:pStyle w:val="MyHeading-1"/>
-        <w:rPr>
-          <w:rFonts w:eastAsia="Aptos"/>
-          <w:lang w:eastAsia="en-US"/>
-        </w:rPr>
       </w:pPr>
       <w:bookmarkStart w:id="20" w:name="_Toc182506683"/>
       <w:bookmarkStart w:id="21" w:name="_Toc182506831"/>
       <w:bookmarkStart w:id="22" w:name="_Toc185158409"/>
       <w:bookmarkStart w:id="23" w:name="_Toc187323518"/>
+    </w:p>
+    <w:p>
+      <w:pPr>
+        <w:pStyle w:val="MyHeading-1"/>
+      </w:pPr>
+    </w:p>
+    <w:p>
+      <w:pPr>
+        <w:pStyle w:val="MyHeading-1"/>
+      </w:pPr>
+    </w:p>
+    <w:p>
+      <w:pPr>
+        <w:pStyle w:val="MyHeading-1"/>
+      </w:pPr>
+    </w:p>
+    <w:p>
+      <w:pPr>
+        <w:pStyle w:val="MyHeading-1"/>
+      </w:pPr>
+    </w:p>
+    <w:p>
+      <w:pPr>
+        <w:pStyle w:val="MyHeading-1"/>
+      </w:pPr>
+    </w:p>
+    <w:p>
+      <w:pPr>
+        <w:pStyle w:val="MyHeading-1"/>
+      </w:pPr>
+    </w:p>
+    <w:p>
+      <w:pPr>
+        <w:pStyle w:val="MyHeading-1"/>
+      </w:pPr>
+    </w:p>
+    <w:p>
+      <w:pPr>
+        <w:pStyle w:val="MyHeading-1"/>
+      </w:pPr>
+    </w:p>
+    <w:p>
+      <w:pPr>
+        <w:pStyle w:val="MyHeading-1"/>
+      </w:pPr>
+    </w:p>
+    <w:p>
+      <w:pPr>
+        <w:pStyle w:val="MyHeading-1"/>
+      </w:pPr>
+    </w:p>
+    <w:p>
+      <w:pPr>
+        <w:pStyle w:val="MyHeading-1"/>
+        <w:rPr>
+          <w:rFonts w:eastAsia="Aptos"/>
+          <w:lang w:eastAsia="en-US"/>
+        </w:rPr>
+      </w:pPr>
       <w:r>
         <w:lastRenderedPageBreak/>
         <w:t xml:space="preserve">CHAPTER 2: </w:t>
@@ -2247,8 +2545,41 @@
         <w:t>AI</w:t>
       </w:r>
       <w:r>
-        <w:t>) that focuses on the development of algorithms and statistical models which enable computers to perform tasks without explicit instructions. Instead, these systems learn from and make predictions or decisions based on data. This ability to improve autonomously from experience makes machine learning a powerful tool across various domains, from healthcare and finance to marketing and autonomous systems.</w:t>
-      </w:r>
+        <w:t>) that focuses on the development of algorithms and statistical models which enable computers to perform tasks without explicit instructions. Instead, these systems learn from and make predictions or decisions based on data. This ability to improve autonomously from experience makes machine learning a powerful tool across various domains, from healthcare and finance to marketing and autonomous systems</w:t>
+      </w:r>
+      <w:r>
+        <w:t xml:space="preserve"> </w:t>
+      </w:r>
+      <w:sdt>
+        <w:sdtPr>
+          <w:id w:val="-212504983"/>
+          <w:citation/>
+        </w:sdtPr>
+        <w:sdtContent>
+          <w:r>
+            <w:fldChar w:fldCharType="begin"/>
+          </w:r>
+          <w:r>
+            <w:rPr>
+              <w:lang w:val="en-GB"/>
+            </w:rPr>
+            <w:instrText xml:space="preserve">CITATION Goo \l 2057 </w:instrText>
+          </w:r>
+          <w:r>
+            <w:fldChar w:fldCharType="separate"/>
+          </w:r>
+          <w:r>
+            <w:rPr>
+              <w:noProof/>
+              <w:lang w:val="en-GB"/>
+            </w:rPr>
+            <w:t>(Goodfellow, 2016)</w:t>
+          </w:r>
+          <w:r>
+            <w:fldChar w:fldCharType="end"/>
+          </w:r>
+        </w:sdtContent>
+      </w:sdt>
     </w:p>
     <w:p>
       <w:pPr>
@@ -2275,11 +2606,104 @@
         <w:t>making processes, optimize operations, and drive innovation. For instance, in healthcare, machine learning can aid in early disease detection by analyzing medical images</w:t>
       </w:r>
       <w:r>
-        <w:t xml:space="preserve">. </w:t>
-      </w:r>
-      <w:r>
-        <w:t>Another abstract example is drawn from finance, where it has the capability to foresee shifts in market trends and spot actions of fraud and deceit, due to machine learning's techniques.</w:t>
-      </w:r>
+        <w:t xml:space="preserve"> </w:t>
+      </w:r>
+      <w:sdt>
+        <w:sdtPr>
+          <w:id w:val="1033241968"/>
+          <w:citation/>
+        </w:sdtPr>
+        <w:sdtContent>
+          <w:r>
+            <w:fldChar w:fldCharType="begin"/>
+          </w:r>
+          <w:r>
+            <w:rPr>
+              <w:lang w:val="en-GB"/>
+            </w:rPr>
+            <w:instrText xml:space="preserve"> CITATION Est171 \l 2057 </w:instrText>
+          </w:r>
+          <w:r>
+            <w:fldChar w:fldCharType="separate"/>
+          </w:r>
+          <w:r>
+            <w:rPr>
+              <w:noProof/>
+              <w:lang w:val="en-GB"/>
+            </w:rPr>
+            <w:t>(Esteva, 2017)</w:t>
+          </w:r>
+          <w:r>
+            <w:fldChar w:fldCharType="end"/>
+          </w:r>
+        </w:sdtContent>
+      </w:sdt>
+      <w:r>
+        <w:t>Another abstract example is drawn from finance, where it has the capability to foresee shifts in market trends and spot actions of fraud and deceit, due to machine learning's techniques</w:t>
+      </w:r>
+      <w:r>
+        <w:rPr>
+          <w:rFonts w:ascii="-webkit-standard" w:hAnsi="-webkit-standard"/>
+          <w:color w:val="000000"/>
+          <w:sz w:val="27"/>
+          <w:szCs w:val="27"/>
+        </w:rPr>
+        <w:t xml:space="preserve"> </w:t>
+      </w:r>
+      <w:sdt>
+        <w:sdtPr>
+          <w:rPr>
+            <w:rFonts w:ascii="-webkit-standard" w:hAnsi="-webkit-standard"/>
+            <w:color w:val="000000"/>
+            <w:sz w:val="27"/>
+            <w:szCs w:val="27"/>
+          </w:rPr>
+          <w:id w:val="-300532713"/>
+          <w:citation/>
+        </w:sdtPr>
+        <w:sdtContent>
+          <w:r>
+            <w:rPr>
+              <w:rFonts w:ascii="-webkit-standard" w:hAnsi="-webkit-standard"/>
+              <w:color w:val="000000"/>
+              <w:sz w:val="27"/>
+              <w:szCs w:val="27"/>
+            </w:rPr>
+            <w:fldChar w:fldCharType="begin"/>
+          </w:r>
+          <w:r>
+            <w:rPr>
+              <w:lang w:val="en-GB"/>
+            </w:rPr>
+            <w:instrText xml:space="preserve"> CITATION Hea171 \l 2057 </w:instrText>
+          </w:r>
+          <w:r>
+            <w:rPr>
+              <w:rFonts w:ascii="-webkit-standard" w:hAnsi="-webkit-standard"/>
+              <w:color w:val="000000"/>
+              <w:sz w:val="27"/>
+              <w:szCs w:val="27"/>
+            </w:rPr>
+            <w:fldChar w:fldCharType="separate"/>
+          </w:r>
+          <w:r>
+            <w:rPr>
+              <w:noProof/>
+              <w:lang w:val="en-GB"/>
+            </w:rPr>
+            <w:t>(Heaton, 2017)</w:t>
+          </w:r>
+          <w:r>
+            <w:rPr>
+              <w:rFonts w:ascii="-webkit-standard" w:hAnsi="-webkit-standard"/>
+              <w:color w:val="000000"/>
+              <w:sz w:val="27"/>
+              <w:szCs w:val="27"/>
+            </w:rPr>
+            <w:fldChar w:fldCharType="end"/>
+          </w:r>
+        </w:sdtContent>
+      </w:sdt>
     </w:p>
     <w:p>
       <w:pPr>
@@ -2311,7 +2735,43 @@
         <w:pStyle w:val="MyNormal"/>
       </w:pPr>
       <w:r>
-        <w:t xml:space="preserve">For decades passing through the twentieth century, one could regard that as the roots of machine learning. The phrase "machine learning", a creation of the intellect named Arthur Samuel, came into existence in 1959. Arthur defined that </w:t>
+        <w:t>For decades passing through the twentieth century, one could regard that as the roots of machine learning. The phrase "machine learning", a creation of the intellect named Arthur Samuel, came into existence in 1959</w:t>
+      </w:r>
+      <w:r>
+        <w:t xml:space="preserve"> </w:t>
+      </w:r>
+      <w:sdt>
+        <w:sdtPr>
+          <w:id w:val="-1211795499"/>
+          <w:citation/>
+        </w:sdtPr>
+        <w:sdtContent>
+          <w:r>
+            <w:fldChar w:fldCharType="begin"/>
+          </w:r>
+          <w:r>
+            <w:rPr>
+              <w:lang w:val="en-GB"/>
+            </w:rPr>
+            <w:instrText xml:space="preserve"> CITATION Art59 \l 2057 </w:instrText>
+          </w:r>
+          <w:r>
+            <w:fldChar w:fldCharType="separate"/>
+          </w:r>
+          <w:r>
+            <w:rPr>
+              <w:noProof/>
+              <w:lang w:val="en-GB"/>
+            </w:rPr>
+            <w:t>(Samuel, 1959)</w:t>
+          </w:r>
+          <w:r>
+            <w:fldChar w:fldCharType="end"/>
+          </w:r>
+        </w:sdtContent>
+      </w:sdt>
+      <w:r>
+        <w:t xml:space="preserve">Arthur defined that </w:t>
       </w:r>
       <w:r>
         <w:t>cognitive</w:t>
@@ -2348,11 +2808,41 @@
         <w:pStyle w:val="MyNormal"/>
       </w:pPr>
       <w:r>
-        <w:t>The 1980s marked the revival of neural networks, inspired by the human brain's structure, which laid the groundwork for modern deep learning techniques. These advancements directly influence technologies like the neural network used in this project to predict user intents and generate chatbot responses.</w:t>
+        <w:t>The 1980s marked the revival of neural networks, inspired by the human brain's structure, which laid the groundwork for modern deep learning techniques. These advancements directly influence technologies like the neural network used in this project to predict user intents and generate chatbot responses</w:t>
       </w:r>
       <w:r>
         <w:t xml:space="preserve"> </w:t>
       </w:r>
+      <w:sdt>
+        <w:sdtPr>
+          <w:id w:val="-2017983177"/>
+          <w:citation/>
+        </w:sdtPr>
+        <w:sdtContent>
+          <w:r>
+            <w:fldChar w:fldCharType="begin"/>
+          </w:r>
+          <w:r>
+            <w:rPr>
+              <w:lang w:val="en-GB"/>
+            </w:rPr>
+            <w:instrText xml:space="preserve"> CITATION LeC151 \l 2057 </w:instrText>
+          </w:r>
+          <w:r>
+            <w:fldChar w:fldCharType="separate"/>
+          </w:r>
+          <w:r>
+            <w:rPr>
+              <w:noProof/>
+              <w:lang w:val="en-GB"/>
+            </w:rPr>
+            <w:t>(LeCun, 2015)</w:t>
+          </w:r>
+          <w:r>
+            <w:fldChar w:fldCharType="end"/>
+          </w:r>
+        </w:sdtContent>
+      </w:sdt>
     </w:p>
     <w:p/>
     <w:p>
@@ -2414,8 +2904,44 @@
         <w:t>Classification:</w:t>
       </w:r>
       <w:r>
-        <w:t> In classification tasks, the model predicts discrete labels. For example, an email spam filter classifies emails as either “spam” or “not spam.”</w:t>
-      </w:r>
+        <w:t> In classification tasks, the model predicts discrete labels. For example, an email spam filter classifies emails as either “spam” or “not spam</w:t>
+      </w:r>
+      <w:r>
+        <w:t>”</w:t>
+      </w:r>
+      <w:r>
+        <w:t xml:space="preserve"> </w:t>
+      </w:r>
+      <w:sdt>
+        <w:sdtPr>
+          <w:id w:val="-1150980648"/>
+          <w:citation/>
+        </w:sdtPr>
+        <w:sdtContent>
+          <w:r>
+            <w:fldChar w:fldCharType="begin"/>
+          </w:r>
+          <w:r>
+            <w:rPr>
+              <w:lang w:val="en-GB"/>
+            </w:rPr>
+            <w:instrText xml:space="preserve"> CITATION Bis06 \l 2057 </w:instrText>
+          </w:r>
+          <w:r>
+            <w:fldChar w:fldCharType="separate"/>
+          </w:r>
+          <w:r>
+            <w:rPr>
+              <w:noProof/>
+              <w:lang w:val="en-GB"/>
+            </w:rPr>
+            <w:t>(Bishop, 2006)</w:t>
+          </w:r>
+          <w:r>
+            <w:fldChar w:fldCharType="end"/>
+          </w:r>
+        </w:sdtContent>
+      </w:sdt>
     </w:p>
     <w:p>
       <w:pPr>
@@ -2429,8 +2955,41 @@
         <w:t>Regression:</w:t>
       </w:r>
       <w:r>
-        <w:t> in regression tasks, the model predicts continuous values. For instance, predicting the price of a house based on its features like location, size, and age.</w:t>
-      </w:r>
+        <w:t> in regression tasks, the model predicts continuous values. For instance, predicting the price of a house based on its features like location, size, and age</w:t>
+      </w:r>
+      <w:r>
+        <w:t xml:space="preserve"> </w:t>
+      </w:r>
+      <w:sdt>
+        <w:sdtPr>
+          <w:id w:val="-1050769499"/>
+          <w:citation/>
+        </w:sdtPr>
+        <w:sdtContent>
+          <w:r>
+            <w:fldChar w:fldCharType="begin"/>
+          </w:r>
+          <w:r>
+            <w:rPr>
+              <w:lang w:val="en-GB"/>
+            </w:rPr>
+            <w:instrText xml:space="preserve"> CITATION Has091 \l 2057 </w:instrText>
+          </w:r>
+          <w:r>
+            <w:fldChar w:fldCharType="separate"/>
+          </w:r>
+          <w:r>
+            <w:rPr>
+              <w:noProof/>
+              <w:lang w:val="en-GB"/>
+            </w:rPr>
+            <w:t>(Hastie, 2009)</w:t>
+          </w:r>
+          <w:r>
+            <w:fldChar w:fldCharType="end"/>
+          </w:r>
+        </w:sdtContent>
+      </w:sdt>
     </w:p>
     <w:p/>
     <w:p>
@@ -2498,8 +3057,71 @@
         <w:t xml:space="preserve"> no</w:t>
       </w:r>
       <w:r>
-        <w:t>t make things neat and tidy; it's a jumbled sort of closeness within data points. There, it's all concentrated, like all the same behaving customers marketing, that is. Like haphazard boxes of candies sorted in marketing's pantry, bunches of boxes are homologous in their flavors. Further examples are a bit slippery. Nonetheless, it renders a rough idea about how clusters work.</w:t>
-      </w:r>
+        <w:t>t make things neat and tidy; it's a jumbled sort of closeness within data points. There, it's all concentrated, like all the same behaving customers marketing, that is. Like haphazard boxes of candies sorted in marketing's pantry, bunches of boxes are homologous in their flavors</w:t>
+      </w:r>
+      <w:r>
+        <w:rPr>
+          <w:rFonts w:ascii="-webkit-standard" w:hAnsi="-webkit-standard"/>
+          <w:color w:val="000000"/>
+          <w:sz w:val="27"/>
+          <w:szCs w:val="27"/>
+        </w:rPr>
+        <w:t xml:space="preserve"> </w:t>
+      </w:r>
+      <w:sdt>
+        <w:sdtPr>
+          <w:rPr>
+            <w:rFonts w:ascii="-webkit-standard" w:hAnsi="-webkit-standard"/>
+            <w:color w:val="000000"/>
+            <w:sz w:val="27"/>
+            <w:szCs w:val="27"/>
+          </w:rPr>
+          <w:id w:val="124822205"/>
+          <w:citation/>
+        </w:sdtPr>
+        <w:sdtContent>
+          <w:r>
+            <w:rPr>
+              <w:rFonts w:ascii="-webkit-standard" w:hAnsi="-webkit-standard"/>
+              <w:color w:val="000000"/>
+              <w:sz w:val="27"/>
+              <w:szCs w:val="27"/>
+            </w:rPr>
+            <w:fldChar w:fldCharType="begin"/>
+          </w:r>
+          <w:r>
+            <w:rPr>
+              <w:lang w:val="en-GB"/>
+            </w:rPr>
+            <w:instrText xml:space="preserve"> CITATION Jai101 \l 2057 </w:instrText>
+          </w:r>
+          <w:r>
+            <w:rPr>
+              <w:rFonts w:ascii="-webkit-standard" w:hAnsi="-webkit-standard"/>
+              <w:color w:val="000000"/>
+              <w:sz w:val="27"/>
+              <w:szCs w:val="27"/>
+            </w:rPr>
+            <w:fldChar w:fldCharType="separate"/>
+          </w:r>
+          <w:r>
+            <w:rPr>
+              <w:noProof/>
+              <w:lang w:val="en-GB"/>
+            </w:rPr>
+            <w:t>(Jain, 2010)</w:t>
+          </w:r>
+          <w:r>
+            <w:rPr>
+              <w:rFonts w:ascii="-webkit-standard" w:hAnsi="-webkit-standard"/>
+              <w:color w:val="000000"/>
+              <w:sz w:val="27"/>
+              <w:szCs w:val="27"/>
+            </w:rPr>
+            <w:fldChar w:fldCharType="end"/>
+          </w:r>
+        </w:sdtContent>
+      </w:sdt>
     </w:p>
     <w:p>
       <w:pPr>
@@ -2513,8 +3135,71 @@
         <w:t>Association:</w:t>
       </w:r>
       <w:r>
-        <w:t> Association algorithms discover relationships between variables in a dataset. For example, market basket analysis in retail can reveal which products are frequently bought together.</w:t>
-      </w:r>
+        <w:t> Association algorithms discover relationships between variables in a dataset. For example, market basket analysis in retail can reveal which products are frequently bought together</w:t>
+      </w:r>
+      <w:r>
+        <w:rPr>
+          <w:rFonts w:ascii="-webkit-standard" w:hAnsi="-webkit-standard"/>
+          <w:color w:val="000000"/>
+          <w:sz w:val="27"/>
+          <w:szCs w:val="27"/>
+        </w:rPr>
+        <w:t xml:space="preserve"> </w:t>
+      </w:r>
+      <w:sdt>
+        <w:sdtPr>
+          <w:rPr>
+            <w:rFonts w:ascii="-webkit-standard" w:hAnsi="-webkit-standard"/>
+            <w:color w:val="000000"/>
+            <w:sz w:val="27"/>
+            <w:szCs w:val="27"/>
+          </w:rPr>
+          <w:id w:val="-2098779466"/>
+          <w:citation/>
+        </w:sdtPr>
+        <w:sdtContent>
+          <w:r>
+            <w:rPr>
+              <w:rFonts w:ascii="-webkit-standard" w:hAnsi="-webkit-standard"/>
+              <w:color w:val="000000"/>
+              <w:sz w:val="27"/>
+              <w:szCs w:val="27"/>
+            </w:rPr>
+            <w:fldChar w:fldCharType="begin"/>
+          </w:r>
+          <w:r>
+            <w:rPr>
+              <w:lang w:val="en-GB"/>
+            </w:rPr>
+            <w:instrText xml:space="preserve"> CITATION Agr93 \l 2057 </w:instrText>
+          </w:r>
+          <w:r>
+            <w:rPr>
+              <w:rFonts w:ascii="-webkit-standard" w:hAnsi="-webkit-standard"/>
+              <w:color w:val="000000"/>
+              <w:sz w:val="27"/>
+              <w:szCs w:val="27"/>
+            </w:rPr>
+            <w:fldChar w:fldCharType="separate"/>
+          </w:r>
+          <w:r>
+            <w:rPr>
+              <w:noProof/>
+              <w:lang w:val="en-GB"/>
+            </w:rPr>
+            <w:t>(Agrawal, 1993)</w:t>
+          </w:r>
+          <w:r>
+            <w:rPr>
+              <w:rFonts w:ascii="-webkit-standard" w:hAnsi="-webkit-standard"/>
+              <w:color w:val="000000"/>
+              <w:sz w:val="27"/>
+              <w:szCs w:val="27"/>
+            </w:rPr>
+            <w:fldChar w:fldCharType="end"/>
+          </w:r>
+        </w:sdtContent>
+      </w:sdt>
       <w:r>
         <w:rPr>
           <w:b/>
@@ -9814,6 +10499,76 @@
     </w:p>
     <w:p>
       <w:pPr>
+        <w:pStyle w:val="MyNormal"/>
+      </w:pPr>
+    </w:p>
+    <w:p>
+      <w:pPr>
+        <w:pStyle w:val="MyNormal"/>
+      </w:pPr>
+    </w:p>
+    <w:p>
+      <w:pPr>
+        <w:pStyle w:val="MyNormal"/>
+      </w:pPr>
+    </w:p>
+    <w:p>
+      <w:pPr>
+        <w:pStyle w:val="MyNormal"/>
+      </w:pPr>
+    </w:p>
+    <w:p>
+      <w:pPr>
+        <w:pStyle w:val="MyNormal"/>
+      </w:pPr>
+    </w:p>
+    <w:p>
+      <w:pPr>
+        <w:pStyle w:val="MyNormal"/>
+      </w:pPr>
+    </w:p>
+    <w:p>
+      <w:pPr>
+        <w:pStyle w:val="MyNormal"/>
+      </w:pPr>
+    </w:p>
+    <w:p>
+      <w:pPr>
+        <w:pStyle w:val="MyNormal"/>
+      </w:pPr>
+    </w:p>
+    <w:p>
+      <w:pPr>
+        <w:pStyle w:val="MyNormal"/>
+      </w:pPr>
+    </w:p>
+    <w:p>
+      <w:pPr>
+        <w:pStyle w:val="MyNormal"/>
+      </w:pPr>
+    </w:p>
+    <w:p>
+      <w:pPr>
+        <w:pStyle w:val="MyNormal"/>
+      </w:pPr>
+    </w:p>
+    <w:p>
+      <w:pPr>
+        <w:pStyle w:val="MyNormal"/>
+      </w:pPr>
+    </w:p>
+    <w:p>
+      <w:pPr>
+        <w:pStyle w:val="MyNormal"/>
+      </w:pPr>
+    </w:p>
+    <w:p>
+      <w:pPr>
+        <w:pStyle w:val="MyNormal"/>
+      </w:pPr>
+    </w:p>
+    <w:p>
+      <w:pPr>
         <w:pStyle w:val="MyHeading-2"/>
         <w:rPr>
           <w:rFonts w:cs="Arial"/>
@@ -9828,6 +10583,7 @@
           <w:bCs w:val="0"/>
           <w:lang w:val="en-PL"/>
         </w:rPr>
+        <w:lastRenderedPageBreak/>
         <w:t>9</w:t>
       </w:r>
       <w:r>
@@ -10003,7 +10759,6 @@
         <w:pStyle w:val="MyNormal"/>
       </w:pPr>
       <w:r>
-        <w:lastRenderedPageBreak/>
         <w:t>“Deep Learning” By Ian Goodfellow, Yoshua Bengio, And Aaron Courville</w:t>
       </w:r>
     </w:p>
@@ -10188,6 +10943,7 @@
         <w:pStyle w:val="MyNormal"/>
       </w:pPr>
       <w:r>
+        <w:lastRenderedPageBreak/>
         <w:t xml:space="preserve">“The Future </w:t>
       </w:r>
       <w:proofErr w:type="gramStart"/>
@@ -10591,6 +11347,7 @@
         <w:rPr>
           <w:lang w:val="en-PL"/>
         </w:rPr>
+        <w:lastRenderedPageBreak/>
         <w:t>S. S. Thomas and R. J. Newman, “Advances in empathetic chatbot design,” </w:t>
       </w:r>
       <w:r>
@@ -10708,7 +11465,6 @@
         <w:rPr>
           <w:lang w:eastAsia="en-GB"/>
         </w:rPr>
-        <w:lastRenderedPageBreak/>
         <w:t xml:space="preserve">Fitzpatrick, K. K., Darcy, A., &amp; </w:t>
       </w:r>
       <w:proofErr w:type="spellStart"/>
@@ -10794,6 +11550,333 @@
         <w:pStyle w:val="MyNormal"/>
       </w:pPr>
     </w:p>
+    <w:sdt>
+      <w:sdtPr>
+        <w:id w:val="349923580"/>
+        <w:docPartObj>
+          <w:docPartGallery w:val="Bibliographies"/>
+          <w:docPartUnique/>
+        </w:docPartObj>
+      </w:sdtPr>
+      <w:sdtEndPr>
+        <w:rPr>
+          <w:b w:val="0"/>
+          <w:bCs w:val="0"/>
+          <w:kern w:val="0"/>
+          <w:sz w:val="24"/>
+          <w:szCs w:val="26"/>
+        </w:rPr>
+      </w:sdtEndPr>
+      <w:sdtContent>
+        <w:p>
+          <w:pPr>
+            <w:pStyle w:val="Heading1"/>
+          </w:pPr>
+          <w:r>
+            <w:t>Bibliography</w:t>
+          </w:r>
+        </w:p>
+        <w:sdt>
+          <w:sdtPr>
+            <w:id w:val="111145805"/>
+            <w:bibliography/>
+          </w:sdtPr>
+          <w:sdtContent>
+            <w:p>
+              <w:pPr>
+                <w:pStyle w:val="Bibliography"/>
+                <w:ind w:left="720" w:hanging="720"/>
+                <w:rPr>
+                  <w:noProof/>
+                  <w:szCs w:val="24"/>
+                </w:rPr>
+              </w:pPr>
+              <w:r>
+                <w:fldChar w:fldCharType="begin"/>
+              </w:r>
+              <w:r>
+                <w:instrText xml:space="preserve"> BIBLIOGRAPHY </w:instrText>
+              </w:r>
+              <w:r>
+                <w:fldChar w:fldCharType="separate"/>
+              </w:r>
+              <w:r>
+                <w:rPr>
+                  <w:i/>
+                  <w:iCs/>
+                  <w:noProof/>
+                </w:rPr>
+                <w:t>World Health Organization</w:t>
+              </w:r>
+              <w:r>
+                <w:rPr>
+                  <w:noProof/>
+                </w:rPr>
+                <w:t>. (2022, 06 17). Retrieved from https://www.who.int/news-room/fact-sheets/detail/mental-health-strengthening-our-response</w:t>
+              </w:r>
+            </w:p>
+            <w:p>
+              <w:pPr>
+                <w:pStyle w:val="Bibliography"/>
+                <w:ind w:left="720" w:hanging="720"/>
+                <w:rPr>
+                  <w:noProof/>
+                </w:rPr>
+              </w:pPr>
+              <w:r>
+                <w:rPr>
+                  <w:noProof/>
+                </w:rPr>
+                <w:t xml:space="preserve">Smith, J. &amp;. (2022). Social dynamics in therapy: Overcoming barriers to care. </w:t>
+              </w:r>
+              <w:r>
+                <w:rPr>
+                  <w:i/>
+                  <w:iCs/>
+                  <w:noProof/>
+                </w:rPr>
+                <w:t>Clinical Psychology Review</w:t>
+              </w:r>
+              <w:r>
+                <w:rPr>
+                  <w:noProof/>
+                </w:rPr>
+                <w:t>.</w:t>
+              </w:r>
+            </w:p>
+            <w:p>
+              <w:pPr>
+                <w:pStyle w:val="Bibliography"/>
+                <w:ind w:left="720" w:hanging="720"/>
+                <w:rPr>
+                  <w:noProof/>
+                </w:rPr>
+              </w:pPr>
+              <w:r>
+                <w:rPr>
+                  <w:noProof/>
+                </w:rPr>
+                <w:t xml:space="preserve">Brown, A. W. (2021). Economic barriers in mental health services: Addressing cost and accessibility issues. </w:t>
+              </w:r>
+              <w:r>
+                <w:rPr>
+                  <w:i/>
+                  <w:iCs/>
+                  <w:noProof/>
+                </w:rPr>
+                <w:t>Journal of Mental Health Policy and Economics</w:t>
+              </w:r>
+              <w:r>
+                <w:rPr>
+                  <w:noProof/>
+                </w:rPr>
+                <w:t>.</w:t>
+              </w:r>
+            </w:p>
+            <w:p>
+              <w:pPr>
+                <w:pStyle w:val="Bibliography"/>
+                <w:ind w:left="720" w:hanging="720"/>
+                <w:rPr>
+                  <w:noProof/>
+                </w:rPr>
+              </w:pPr>
+              <w:r>
+                <w:rPr>
+                  <w:noProof/>
+                </w:rPr>
+                <w:t xml:space="preserve">Davis, P. R. (2020). AI in mental health: Bridging the gap. </w:t>
+              </w:r>
+              <w:r>
+                <w:rPr>
+                  <w:i/>
+                  <w:iCs/>
+                  <w:noProof/>
+                </w:rPr>
+                <w:t>Advances in Digital Psychology</w:t>
+              </w:r>
+              <w:r>
+                <w:rPr>
+                  <w:noProof/>
+                </w:rPr>
+                <w:t>.</w:t>
+              </w:r>
+            </w:p>
+            <w:p>
+              <w:pPr>
+                <w:pStyle w:val="Bibliography"/>
+                <w:ind w:left="720" w:hanging="720"/>
+                <w:rPr>
+                  <w:noProof/>
+                </w:rPr>
+              </w:pPr>
+              <w:r>
+                <w:rPr>
+                  <w:noProof/>
+                </w:rPr>
+                <w:t xml:space="preserve">Illness, N. A. (n.d.). </w:t>
+              </w:r>
+              <w:r>
+                <w:rPr>
+                  <w:i/>
+                  <w:iCs/>
+                  <w:noProof/>
+                </w:rPr>
+                <w:t>nami.org</w:t>
+              </w:r>
+              <w:r>
+                <w:rPr>
+                  <w:noProof/>
+                </w:rPr>
+                <w:t>. Retrieved from Stigma and mental health: https://www.nami.org/about-mental-illness/</w:t>
+              </w:r>
+            </w:p>
+            <w:p>
+              <w:pPr>
+                <w:pStyle w:val="Bibliography"/>
+                <w:ind w:left="720" w:hanging="720"/>
+                <w:rPr>
+                  <w:noProof/>
+                </w:rPr>
+              </w:pPr>
+              <w:r>
+                <w:rPr>
+                  <w:noProof/>
+                </w:rPr>
+                <w:t xml:space="preserve">Goodfellow, I. B. (2016). </w:t>
+              </w:r>
+              <w:r>
+                <w:rPr>
+                  <w:i/>
+                  <w:iCs/>
+                  <w:noProof/>
+                </w:rPr>
+                <w:t>Deep learning.</w:t>
+              </w:r>
+              <w:r>
+                <w:rPr>
+                  <w:noProof/>
+                </w:rPr>
+                <w:t xml:space="preserve"> MIT Press.</w:t>
+              </w:r>
+            </w:p>
+            <w:p>
+              <w:pPr>
+                <w:pStyle w:val="Bibliography"/>
+                <w:ind w:left="720" w:hanging="720"/>
+                <w:rPr>
+                  <w:noProof/>
+                </w:rPr>
+              </w:pPr>
+              <w:r>
+                <w:rPr>
+                  <w:noProof/>
+                </w:rPr>
+                <w:lastRenderedPageBreak/>
+                <w:t xml:space="preserve">Esteva, A. K. (2017). Dermatologist-level classification of skin cancer with deep neural networks. </w:t>
+              </w:r>
+              <w:r>
+                <w:rPr>
+                  <w:i/>
+                  <w:iCs/>
+                  <w:noProof/>
+                </w:rPr>
+                <w:t>Name</w:t>
+              </w:r>
+              <w:r>
+                <w:rPr>
+                  <w:noProof/>
+                </w:rPr>
+                <w:t>.</w:t>
+              </w:r>
+            </w:p>
+            <w:p>
+              <w:pPr>
+                <w:pStyle w:val="Bibliography"/>
+                <w:ind w:left="720" w:hanging="720"/>
+                <w:rPr>
+                  <w:noProof/>
+                </w:rPr>
+              </w:pPr>
+              <w:r>
+                <w:rPr>
+                  <w:noProof/>
+                </w:rPr>
+                <w:t xml:space="preserve">Heaton, J. B. (2017). Deep learning in finance. </w:t>
+              </w:r>
+              <w:r>
+                <w:rPr>
+                  <w:i/>
+                  <w:iCs/>
+                  <w:noProof/>
+                </w:rPr>
+                <w:t>Annual Review of Financial Economics</w:t>
+              </w:r>
+              <w:r>
+                <w:rPr>
+                  <w:noProof/>
+                </w:rPr>
+                <w:t>.</w:t>
+              </w:r>
+            </w:p>
+            <w:p>
+              <w:pPr>
+                <w:pStyle w:val="Bibliography"/>
+                <w:ind w:left="720" w:hanging="720"/>
+                <w:rPr>
+                  <w:noProof/>
+                </w:rPr>
+              </w:pPr>
+              <w:r>
+                <w:rPr>
+                  <w:noProof/>
+                </w:rPr>
+                <w:t xml:space="preserve">Samuel, A. (1959). Some studies in machine learning using the game of checkers. </w:t>
+              </w:r>
+              <w:r>
+                <w:rPr>
+                  <w:i/>
+                  <w:iCs/>
+                  <w:noProof/>
+                </w:rPr>
+                <w:t>BM Journal of Research and Development</w:t>
+              </w:r>
+              <w:r>
+                <w:rPr>
+                  <w:noProof/>
+                </w:rPr>
+                <w:t>.</w:t>
+              </w:r>
+            </w:p>
+            <w:p>
+              <w:pPr>
+                <w:pStyle w:val="Bibliography"/>
+                <w:ind w:left="720" w:hanging="720"/>
+                <w:rPr>
+                  <w:noProof/>
+                </w:rPr>
+              </w:pPr>
+              <w:r>
+                <w:rPr>
+                  <w:noProof/>
+                </w:rPr>
+                <w:t>(n.d.).</w:t>
+              </w:r>
+            </w:p>
+            <w:p>
+              <w:r>
+                <w:rPr>
+                  <w:b/>
+                  <w:bCs/>
+                  <w:noProof/>
+                </w:rPr>
+                <w:fldChar w:fldCharType="end"/>
+              </w:r>
+            </w:p>
+          </w:sdtContent>
+        </w:sdt>
+      </w:sdtContent>
+    </w:sdt>
     <w:p>
       <w:pPr>
         <w:rPr>
@@ -31413,6 +32496,14 @@
       <w:lang w:val="en-US" w:eastAsia="pl-PL"/>
     </w:rPr>
   </w:style>
+  <w:style w:type="paragraph" w:styleId="Bibliography">
+    <w:name w:val="Bibliography"/>
+    <w:basedOn w:val="Normal"/>
+    <w:next w:val="Normal"/>
+    <w:uiPriority w:val="37"/>
+    <w:unhideWhenUsed/>
+    <w:rsid w:val="00D02D10"/>
+  </w:style>
 </w:styles>
 </file>
 
@@ -31712,10 +32803,6 @@
 </file>
 
 <file path=customXml/item1.xml><?xml version="1.0" encoding="utf-8"?>
-<b:Sources xmlns:b="http://schemas.openxmlformats.org/officeDocument/2006/bibliography" xmlns="http://schemas.openxmlformats.org/officeDocument/2006/bibliography" SelectedStyle="/APASixthEditionOfficeOnline.xsl" StyleName="APA" Version="6"/>
-</file>
-
-<file path=customXml/item2.xml><?xml version="1.0" encoding="utf-8"?>
 <ct:contentTypeSchema xmlns:ct="http://schemas.microsoft.com/office/2006/metadata/contentType" xmlns:ma="http://schemas.microsoft.com/office/2006/metadata/properties/metaAttributes" ct:_="" ma:_="" ma:contentTypeName="Dokument" ma:contentTypeID="0x010100F090994DA9F92240A0FB891C5C05655C" ma:contentTypeVersion="7" ma:contentTypeDescription="Utwórz nowy dokument." ma:contentTypeScope="" ma:versionID="72f701b5e34d3f5e7f8231cc45a5a5b7">
   <xsd:schema xmlns:xsd="http://www.w3.org/2001/XMLSchema" xmlns:xs="http://www.w3.org/2001/XMLSchema" xmlns:p="http://schemas.microsoft.com/office/2006/metadata/properties" xmlns:ns2="822b80ae-0e87-4f01-9f6a-612341f9862f" xmlns:ns3="90d9b639-29ae-47e8-a575-9a9f6e43625b" targetNamespace="http://schemas.microsoft.com/office/2006/metadata/properties" ma:root="true" ma:fieldsID="e7090c3df91e9a368fff758958eb312a" ns2:_="" ns3:_="">
     <xsd:import namespace="822b80ae-0e87-4f01-9f6a-612341f9862f"/>
@@ -31900,7 +32987,7 @@
 </ct:contentTypeSchema>
 </file>
 
-<file path=customXml/item3.xml><?xml version="1.0" encoding="utf-8"?>
+<file path=customXml/item2.xml><?xml version="1.0" encoding="utf-8"?>
 <?mso-contentType ?>
 <FormTemplates xmlns="http://schemas.microsoft.com/sharepoint/v3/contenttype/forms">
   <Display>DocumentLibraryForm</Display>
@@ -31909,19 +32996,292 @@
 </FormTemplates>
 </file>
 
-<file path=customXml/item4.xml><?xml version="1.0" encoding="utf-8"?>
+<file path=customXml/item3.xml><?xml version="1.0" encoding="utf-8"?>
 <writefull-cache xmlns="urn:writefull-cache:Suggestions">{"suggestions":{},"typeOfAccount":"freemium"}</writefull-cache>
 </file>
 
-<file path=customXml/itemProps1.xml><?xml version="1.0" encoding="utf-8"?>
-<ds:datastoreItem xmlns:ds="http://schemas.openxmlformats.org/officeDocument/2006/customXml" ds:itemID="{38094F78-04CB-F444-93A7-8D3B3BDFC6E5}">
-  <ds:schemaRefs>
-    <ds:schemaRef ds:uri="http://schemas.openxmlformats.org/officeDocument/2006/bibliography"/>
-  </ds:schemaRefs>
-</ds:datastoreItem>
+<file path=customXml/item4.xml><?xml version="1.0" encoding="utf-8"?>
+<b:Sources xmlns:b="http://schemas.openxmlformats.org/officeDocument/2006/bibliography" xmlns="http://schemas.openxmlformats.org/officeDocument/2006/bibliography" SelectedStyle="/APASixthEditionOfficeOnline.xsl" StyleName="APA" Version="6">
+  <b:Source>
+    <b:Tag>Wor22</b:Tag>
+    <b:SourceType>InternetSite</b:SourceType>
+    <b:Guid>{1274F877-419B-A04F-A639-BCB7A5D480F5}</b:Guid>
+    <b:Title>World Health Organization</b:Title>
+    <b:Year>2022</b:Year>
+    <b:URL>https://www.who.int/news-room/fact-sheets/detail/mental-health-strengthening-our-response</b:URL>
+    <b:Month>06</b:Month>
+    <b:Day>17</b:Day>
+    <b:RefOrder>1</b:RefOrder>
+  </b:Source>
+  <b:Source>
+    <b:Tag>Smi221</b:Tag>
+    <b:SourceType>JournalArticle</b:SourceType>
+    <b:Guid>{EEC9068C-890E-6E45-ADDF-707A21FDE195}</b:Guid>
+    <b:Author>
+      <b:Author>
+        <b:NameList>
+          <b:Person>
+            <b:Last>Smith</b:Last>
+            <b:First>J.,</b:First>
+            <b:Middle>&amp; Jones, R.</b:Middle>
+          </b:Person>
+        </b:NameList>
+      </b:Author>
+    </b:Author>
+    <b:Title>Social dynamics in therapy: Overcoming barriers to care</b:Title>
+    <b:Year>2022</b:Year>
+    <b:JournalName>Clinical Psychology Review</b:JournalName>
+    <b:RefOrder>2</b:RefOrder>
+  </b:Source>
+  <b:Source>
+    <b:Tag>Bro211</b:Tag>
+    <b:SourceType>JournalArticle</b:SourceType>
+    <b:Guid>{A71D5F1B-693C-4A49-938C-47103A6C5E6D}</b:Guid>
+    <b:Author>
+      <b:Author>
+        <b:NameList>
+          <b:Person>
+            <b:Last>Brown</b:Last>
+            <b:First>A.,</b:First>
+            <b:Middle>Wilson, T., &amp; Clark, L.</b:Middle>
+          </b:Person>
+        </b:NameList>
+      </b:Author>
+    </b:Author>
+    <b:Title>Economic barriers in mental health services: Addressing cost and accessibility issues</b:Title>
+    <b:JournalName>Journal of Mental Health Policy and Economics</b:JournalName>
+    <b:Year>2021</b:Year>
+    <b:RefOrder>3</b:RefOrder>
+  </b:Source>
+  <b:Source>
+    <b:Tag>Placeholder1</b:Tag>
+    <b:SourceType>JournalArticle</b:SourceType>
+    <b:Guid>{B996E317-FF52-584A-8615-BD73F4598C6F}</b:Guid>
+    <b:RefOrder>15</b:RefOrder>
+  </b:Source>
+  <b:Source>
+    <b:Tag>Dav201</b:Tag>
+    <b:SourceType>JournalArticle</b:SourceType>
+    <b:Guid>{0CAB7DE8-1736-C049-BDA3-209C72E9779E}</b:Guid>
+    <b:Author>
+      <b:Author>
+        <b:NameList>
+          <b:Person>
+            <b:Last>Davis</b:Last>
+            <b:First>P.,</b:First>
+            <b:Middle>Richards, S., &amp; Nguyen, T.</b:Middle>
+          </b:Person>
+        </b:NameList>
+      </b:Author>
+    </b:Author>
+    <b:Title>AI in mental health: Bridging the gap</b:Title>
+    <b:JournalName>Advances in Digital Psychology</b:JournalName>
+    <b:Year>2020</b:Year>
+    <b:RefOrder>4</b:RefOrder>
+  </b:Source>
+  <b:Source>
+    <b:Tag>Ill</b:Tag>
+    <b:SourceType>InternetSite</b:SourceType>
+    <b:Guid>{7F189A77-2134-124E-AA10-0CAF6606A295}</b:Guid>
+    <b:Author>
+      <b:Author>
+        <b:NameList>
+          <b:Person>
+            <b:Last>Illness</b:Last>
+            <b:First>National</b:First>
+            <b:Middle>Alliance on Mental</b:Middle>
+          </b:Person>
+        </b:NameList>
+      </b:Author>
+    </b:Author>
+    <b:Title>nami.org</b:Title>
+    <b:InternetSiteTitle>Stigma and mental health</b:InternetSiteTitle>
+    <b:URL>https://www.nami.org/about-mental-illness/</b:URL>
+    <b:RefOrder>5</b:RefOrder>
+  </b:Source>
+  <b:Source>
+    <b:Tag>Goo</b:Tag>
+    <b:SourceType>Book</b:SourceType>
+    <b:Guid>{75EFA34B-32AD-0445-BE24-545C2B9D8C7F}</b:Guid>
+    <b:Author>
+      <b:Author>
+        <b:NameList>
+          <b:Person>
+            <b:Last>Goodfellow</b:Last>
+            <b:First>I.,</b:First>
+            <b:Middle>Bengio, Y., &amp; Courville, A.</b:Middle>
+          </b:Person>
+        </b:NameList>
+      </b:Author>
+    </b:Author>
+    <b:Title>Deep learning</b:Title>
+    <b:Publisher>MIT Press</b:Publisher>
+    <b:Year>2016</b:Year>
+    <b:RefOrder>6</b:RefOrder>
+  </b:Source>
+  <b:Source>
+    <b:Tag>Est171</b:Tag>
+    <b:SourceType>JournalArticle</b:SourceType>
+    <b:Guid>{452E1292-9B70-3D4F-BCF4-1858954608D1}</b:Guid>
+    <b:Author>
+      <b:Author>
+        <b:NameList>
+          <b:Person>
+            <b:Last>Esteva</b:Last>
+            <b:First>A.,</b:First>
+            <b:Middle>Kuprel, B., Novoa, R. A., Ko, J., Swetter, S. M., Blau, H. M., &amp; Thrun, S.</b:Middle>
+          </b:Person>
+        </b:NameList>
+      </b:Author>
+    </b:Author>
+    <b:Title>Dermatologist-level classification of skin cancer with deep neural networks</b:Title>
+    <b:Year>2017</b:Year>
+    <b:JournalName>Name</b:JournalName>
+    <b:RefOrder>7</b:RefOrder>
+  </b:Source>
+  <b:Source>
+    <b:Tag>Hea171</b:Tag>
+    <b:SourceType>JournalArticle</b:SourceType>
+    <b:Guid>{1DF65381-D6E4-7544-8697-D862A17D20B4}</b:Guid>
+    <b:Author>
+      <b:Author>
+        <b:NameList>
+          <b:Person>
+            <b:Last>Heaton</b:Last>
+            <b:First>J.</b:First>
+            <b:Middle>B., Polson, N. G., &amp; Witte, J. H.</b:Middle>
+          </b:Person>
+        </b:NameList>
+      </b:Author>
+    </b:Author>
+    <b:Title>Deep learning in finance</b:Title>
+    <b:JournalName>Annual Review of Financial Economics</b:JournalName>
+    <b:Year>2017</b:Year>
+    <b:RefOrder>8</b:RefOrder>
+  </b:Source>
+  <b:Source>
+    <b:Tag>Art59</b:Tag>
+    <b:SourceType>JournalArticle</b:SourceType>
+    <b:Guid>{CDC9D0AC-47DF-164B-9A01-99A1C053799B}</b:Guid>
+    <b:Author>
+      <b:Author>
+        <b:NameList>
+          <b:Person>
+            <b:Last>Samuel</b:Last>
+            <b:First>Arthur</b:First>
+          </b:Person>
+        </b:NameList>
+      </b:Author>
+    </b:Author>
+    <b:Title>Some studies in machine learning using the game of checkers</b:Title>
+    <b:JournalName>BM Journal of Research and Development</b:JournalName>
+    <b:Year>1959</b:Year>
+    <b:RefOrder>9</b:RefOrder>
+  </b:Source>
+  <b:Source>
+    <b:Tag>LeC151</b:Tag>
+    <b:SourceType>JournalArticle</b:SourceType>
+    <b:Guid>{FDAA8166-16B4-2541-B445-2F5FD8AA1C42}</b:Guid>
+    <b:Author>
+      <b:Author>
+        <b:NameList>
+          <b:Person>
+            <b:Last>LeCun</b:Last>
+            <b:First>Y.,</b:First>
+            <b:Middle>Bengio, Y., &amp; Hinton, G.</b:Middle>
+          </b:Person>
+        </b:NameList>
+      </b:Author>
+    </b:Author>
+    <b:Title>Deep learning</b:Title>
+    <b:JournalName>Nature</b:JournalName>
+    <b:Year>2015</b:Year>
+    <b:RefOrder>10</b:RefOrder>
+  </b:Source>
+  <b:Source>
+    <b:Tag>Bis06</b:Tag>
+    <b:SourceType>Book</b:SourceType>
+    <b:Guid>{02EA4B46-8D0D-FA42-8428-218E5D41B4B3}</b:Guid>
+    <b:Author>
+      <b:Author>
+        <b:NameList>
+          <b:Person>
+            <b:Last>Bishop</b:Last>
+            <b:First>C.</b:First>
+            <b:Middle>M.</b:Middle>
+          </b:Person>
+        </b:NameList>
+      </b:Author>
+    </b:Author>
+    <b:Title>Pattern recognition and machine learning</b:Title>
+    <b:Year>2006</b:Year>
+    <b:Publisher>New York: Springer</b:Publisher>
+    <b:RefOrder>11</b:RefOrder>
+  </b:Source>
+  <b:Source>
+    <b:Tag>Has091</b:Tag>
+    <b:SourceType>Book</b:SourceType>
+    <b:Guid>{ED662B54-B7F6-E34D-B071-B12D11D379E4}</b:Guid>
+    <b:Author>
+      <b:Author>
+        <b:NameList>
+          <b:Person>
+            <b:Last>Hastie</b:Last>
+            <b:First>T.,</b:First>
+            <b:Middle>Tibshirani, R., &amp; Friedman, J.</b:Middle>
+          </b:Person>
+        </b:NameList>
+      </b:Author>
+    </b:Author>
+    <b:Title>The elements of statistical learning: Data mining, inference, and prediction</b:Title>
+    <b:Publisher>New York: Springer</b:Publisher>
+    <b:Year>2009</b:Year>
+    <b:RefOrder>12</b:RefOrder>
+  </b:Source>
+  <b:Source>
+    <b:Tag>Jai101</b:Tag>
+    <b:SourceType>JournalArticle</b:SourceType>
+    <b:Guid>{C983B7B3-8976-5B47-A2A4-D3BD37A36641}</b:Guid>
+    <b:Author>
+      <b:Author>
+        <b:NameList>
+          <b:Person>
+            <b:Last>Jain</b:Last>
+            <b:First>A.</b:First>
+            <b:Middle>K.</b:Middle>
+          </b:Person>
+        </b:NameList>
+      </b:Author>
+    </b:Author>
+    <b:Title>Data clustering: 50 years beyond K-means</b:Title>
+    <b:Year>2010</b:Year>
+    <b:JournalName>Pattern Recognition Letters</b:JournalName>
+    <b:RefOrder>13</b:RefOrder>
+  </b:Source>
+  <b:Source>
+    <b:Tag>Agr93</b:Tag>
+    <b:SourceType>ConferenceProceedings</b:SourceType>
+    <b:Guid>{083255EF-DEC8-234A-99F4-DA87629D30E7}</b:Guid>
+    <b:Title>Mining association rules between sets of items in large databases</b:Title>
+    <b:Year>1993</b:Year>
+    <b:Author>
+      <b:Author>
+        <b:NameList>
+          <b:Person>
+            <b:Last>Agrawal</b:Last>
+            <b:First>R.,</b:First>
+            <b:Middle>Imieliński, T., &amp; Swami, A.</b:Middle>
+          </b:Person>
+        </b:NameList>
+      </b:Author>
+    </b:Author>
+    <b:ConferenceName>Proceedings of the 1993 ACM SIGMOD International Conference on Management of Data</b:ConferenceName>
+    <b:RefOrder>14</b:RefOrder>
+  </b:Source>
+</b:Sources>
 </file>
 
-<file path=customXml/itemProps2.xml><?xml version="1.0" encoding="utf-8"?>
+<file path=customXml/itemProps1.xml><?xml version="1.0" encoding="utf-8"?>
 <ds:datastoreItem xmlns:ds="http://schemas.openxmlformats.org/officeDocument/2006/customXml" ds:itemID="{C4E54CAE-2C27-41FE-8789-D8E790110399}">
   <ds:schemaRefs>
     <ds:schemaRef ds:uri="http://schemas.microsoft.com/office/2006/metadata/contentType"/>
@@ -31940,7 +33300,7 @@
 </ds:datastoreItem>
 </file>
 
-<file path=customXml/itemProps3.xml><?xml version="1.0" encoding="utf-8"?>
+<file path=customXml/itemProps2.xml><?xml version="1.0" encoding="utf-8"?>
 <ds:datastoreItem xmlns:ds="http://schemas.openxmlformats.org/officeDocument/2006/customXml" ds:itemID="{4FD5CDA0-B3E4-4D42-8198-900916607C4E}">
   <ds:schemaRefs>
     <ds:schemaRef ds:uri="http://schemas.microsoft.com/sharepoint/v3/contenttype/forms"/>
@@ -31948,10 +33308,18 @@
 </ds:datastoreItem>
 </file>
 
-<file path=customXml/itemProps4.xml><?xml version="1.0" encoding="utf-8"?>
+<file path=customXml/itemProps3.xml><?xml version="1.0" encoding="utf-8"?>
 <ds:datastoreItem xmlns:ds="http://schemas.openxmlformats.org/officeDocument/2006/customXml" ds:itemID="{8AFB7E3B-BCED-424C-9932-234D5D2A305A}">
   <ds:schemaRefs>
     <ds:schemaRef ds:uri="urn:writefull-cache:Suggestions"/>
   </ds:schemaRefs>
 </ds:datastoreItem>
+</file>
+
+<file path=customXml/itemProps4.xml><?xml version="1.0" encoding="utf-8"?>
+<ds:datastoreItem xmlns:ds="http://schemas.openxmlformats.org/officeDocument/2006/customXml" ds:itemID="{39E78F6B-63A8-F54D-908A-495D3A08F7B9}">
+  <ds:schemaRefs>
+    <ds:schemaRef ds:uri="http://schemas.openxmlformats.org/officeDocument/2006/bibliography"/>
+  </ds:schemaRefs>
+</ds:datastoreItem>
 </file>
</xml_diff>